<commit_message>
New word format to incorporate oneliners
</commit_message>
<xml_diff>
--- a/share/word/reference.docx
+++ b/share/word/reference.docx
@@ -195,7 +195,6 @@
         <w:tblStyle w:val="Table"/>
         <w:tblW w:w="0" w:type="auto"/>
         <w:tblLook w:val="07E0" w:firstRow="1" w:lastRow="1" w:firstColumn="1" w:lastColumn="1" w:noHBand="1" w:noVBand="1"/>
-        <w:tblCaption w:val="Table caption."/>
       </w:tblPr>
       <w:tblGrid>
         <w:gridCol w:w="782"/>
@@ -303,8 +302,11 @@
     </w:p>
     <w:p>
       <w:pPr>
-        <w:pStyle w:val="Definition"/>
-      </w:pPr>
+        <w:pStyle w:val="OneLiner"/>
+      </w:pPr>
+      <w:r>
+        <w:t>role: content</w:t>
+      </w:r>
     </w:p>
     <w:p>
       <w:pPr>
@@ -1426,10 +1428,39 @@
   <w:style w:type="paragraph" w:customStyle="1" w:styleId="UserBlock">
     <w:name w:val="UserBlock"/>
     <w:basedOn w:val="Normal"/>
+    <w:link w:val="UserBlockChar"/>
     <w:qFormat/>
     <w:rsid w:val="00167B89"/>
     <w:rPr>
       <w:color w:val="00B050"/>
+    </w:rPr>
+  </w:style>
+  <w:style w:type="paragraph" w:customStyle="1" w:styleId="OneLiner">
+    <w:name w:val="OneLiner"/>
+    <w:basedOn w:val="UserBlock"/>
+    <w:link w:val="OneLinerChar"/>
+    <w:qFormat/>
+    <w:rsid w:val="00CA4E4E"/>
+    <w:rPr>
+      <w:color w:val="D86DCB" w:themeColor="accent5" w:themeTint="99"/>
+    </w:rPr>
+  </w:style>
+  <w:style w:type="character" w:customStyle="1" w:styleId="UserBlockChar">
+    <w:name w:val="UserBlock Char"/>
+    <w:basedOn w:val="DefaultParagraphFont"/>
+    <w:link w:val="UserBlock"/>
+    <w:rsid w:val="00CA4E4E"/>
+    <w:rPr>
+      <w:color w:val="00B050"/>
+    </w:rPr>
+  </w:style>
+  <w:style w:type="character" w:customStyle="1" w:styleId="OneLinerChar">
+    <w:name w:val="OneLiner Char"/>
+    <w:basedOn w:val="UserBlockChar"/>
+    <w:link w:val="OneLiner"/>
+    <w:rsid w:val="00CA4E4E"/>
+    <w:rPr>
+      <w:color w:val="D86DCB" w:themeColor="accent5" w:themeTint="99"/>
     </w:rPr>
   </w:style>
 </w:styles>

</xml_diff>